<commit_message>
Dodano testowy plik cpp
</commit_message>
<xml_diff>
--- a/dokumentacja.docx
+++ b/dokumentacja.docx
@@ -4,10 +4,24 @@
   <w:body>
     <w:p>
       <w:r>
-        <w:t>Start</w:t>
+        <w:t>Start projektu dnia 31.05.2026r.</w:t>
       </w:r>
       <w:r>
-        <w:t xml:space="preserve"> projektu dnia 31.05.2026r.</w:t>
+        <w:br/>
+      </w:r>
+    </w:p>
+    <w:p/>
+    <w:p>
+      <w:r>
+        <w:t>31.05.2026r.</w:t>
+      </w:r>
+      <w:r>
+        <w:br/>
+        <w:t>Testowy kod,</w:t>
+      </w:r>
+      <w:r>
+        <w:br/>
+        <w:t>by sprawdzić czy wszystko działa i się zapisuje w chmurze.</w:t>
       </w:r>
       <w:bookmarkStart w:id="0" w:name="_GoBack"/>
       <w:bookmarkEnd w:id="0"/>

</xml_diff>

<commit_message>
Dosanie mozliwosci poruszania sie po labiryncie
</commit_message>
<xml_diff>
--- a/dokumentacja.docx
+++ b/dokumentacja.docx
@@ -167,10 +167,7 @@
         </w:pBdr>
       </w:pPr>
       <w:r>
-        <w:t>Data: 02.06</w:t>
-      </w:r>
-      <w:r>
-        <w:t>.2026 r.</w:t>
+        <w:t>Data: 02.06.2026 r.</w:t>
       </w:r>
     </w:p>
     <w:p>
@@ -342,10 +339,7 @@
         <w:t xml:space="preserve"> </w:t>
       </w:r>
       <w:r>
-        <w:t xml:space="preserve">Stworzenie pliku o nazwie gra.cpp w którym będzie </w:t>
-      </w:r>
-      <w:r>
-        <w:t>się znajdować kod gry.</w:t>
+        <w:t>Stworzenie pliku o nazwie gra.cpp w którym będzie się znajdować kod gry.</w:t>
       </w:r>
       <w:r>
         <w:br/>
@@ -408,10 +402,7 @@
         </w:pBdr>
       </w:pPr>
       <w:r>
-        <w:t>Data: 03.06</w:t>
-      </w:r>
-      <w:r>
-        <w:t>.2026 r.</w:t>
+        <w:t>Data: 03.06.2026 r.</w:t>
       </w:r>
     </w:p>
     <w:p/>
@@ -421,7 +412,815 @@
       </w:r>
       <w:r>
         <w:br/>
-        <w:t xml:space="preserve">Dzisiaj skupiłem się na sprawdzeniu czy </w:t>
+        <w:t>Dzisiaj skupił</w:t>
+      </w:r>
+      <w:r>
+        <w:t>em się na sprawdzeniu czy wszys</w:t>
+      </w:r>
+      <w:r>
+        <w:t xml:space="preserve">ko się popranie zapisuje w chmurze i </w:t>
+      </w:r>
+      <w:proofErr w:type="spellStart"/>
+      <w:r>
+        <w:t>wysyla</w:t>
+      </w:r>
+      <w:proofErr w:type="spellEnd"/>
+      <w:r>
+        <w:t xml:space="preserve"> oraz na stworzeniu planszy gry czyli labiryntu.</w:t>
+      </w:r>
+    </w:p>
+    <w:p>
+      <w:r>
+        <w:rPr>
+          <w:noProof/>
+        </w:rPr>
+        <w:drawing>
+          <wp:anchor distT="0" distB="0" distL="114300" distR="114300" simplePos="0" relativeHeight="251650560" behindDoc="1" locked="0" layoutInCell="1" allowOverlap="1" wp14:anchorId="3E9DB021" wp14:editId="427AB2D6">
+            <wp:simplePos x="0" y="0"/>
+            <wp:positionH relativeFrom="column">
+              <wp:posOffset>28704</wp:posOffset>
+            </wp:positionH>
+            <wp:positionV relativeFrom="paragraph">
+              <wp:posOffset>537080</wp:posOffset>
+            </wp:positionV>
+            <wp:extent cx="4119664" cy="3765141"/>
+            <wp:effectExtent l="0" t="0" r="0" b="0"/>
+            <wp:wrapNone/>
+            <wp:docPr id="1" name="Obraz 1" descr="C:\Users\jasin\OneDrive\Obrazy\Zrzuty ekranu\Zrzut ekranu (231).png"/>
+            <wp:cNvGraphicFramePr>
+              <a:graphicFrameLocks xmlns:a="http://schemas.openxmlformats.org/drawingml/2006/main" noChangeAspect="1"/>
+            </wp:cNvGraphicFramePr>
+            <a:graphic xmlns:a="http://schemas.openxmlformats.org/drawingml/2006/main">
+              <a:graphicData uri="http://schemas.openxmlformats.org/drawingml/2006/picture">
+                <pic:pic xmlns:pic="http://schemas.openxmlformats.org/drawingml/2006/picture">
+                  <pic:nvPicPr>
+                    <pic:cNvPr id="0" name="Picture 1" descr="C:\Users\jasin\OneDrive\Obrazy\Zrzuty ekranu\Zrzut ekranu (231).png"/>
+                    <pic:cNvPicPr>
+                      <a:picLocks noChangeAspect="1" noChangeArrowheads="1"/>
+                    </pic:cNvPicPr>
+                  </pic:nvPicPr>
+                  <pic:blipFill>
+                    <a:blip r:embed="rId4">
+                      <a:extLst>
+                        <a:ext uri="{28A0092B-C50C-407E-A947-70E740481C1C}">
+                          <a14:useLocalDpi xmlns:a14="http://schemas.microsoft.com/office/drawing/2010/main" val="0"/>
+                        </a:ext>
+                      </a:extLst>
+                    </a:blip>
+                    <a:srcRect/>
+                    <a:stretch>
+                      <a:fillRect/>
+                    </a:stretch>
+                  </pic:blipFill>
+                  <pic:spPr bwMode="auto">
+                    <a:xfrm>
+                      <a:off x="0" y="0"/>
+                      <a:ext cx="4119664" cy="3765141"/>
+                    </a:xfrm>
+                    <a:prstGeom prst="rect">
+                      <a:avLst/>
+                    </a:prstGeom>
+                    <a:noFill/>
+                    <a:ln>
+                      <a:noFill/>
+                    </a:ln>
+                  </pic:spPr>
+                </pic:pic>
+              </a:graphicData>
+            </a:graphic>
+            <wp14:sizeRelH relativeFrom="page">
+              <wp14:pctWidth>0</wp14:pctWidth>
+            </wp14:sizeRelH>
+            <wp14:sizeRelV relativeFrom="page">
+              <wp14:pctHeight>0</wp14:pctHeight>
+            </wp14:sizeRelV>
+          </wp:anchor>
+        </w:drawing>
+      </w:r>
+      <w:r>
+        <w:t>2.Wykonanie czynności:</w:t>
+      </w:r>
+      <w:r>
+        <w:br/>
+        <w:t xml:space="preserve">+ Wysłanie wczorajszych </w:t>
+      </w:r>
+      <w:proofErr w:type="spellStart"/>
+      <w:r>
+        <w:t>plikow</w:t>
+      </w:r>
+      <w:proofErr w:type="spellEnd"/>
+      <w:r>
+        <w:t xml:space="preserve"> na </w:t>
+      </w:r>
+      <w:proofErr w:type="spellStart"/>
+      <w:r>
+        <w:t>chmure</w:t>
+      </w:r>
+      <w:proofErr w:type="spellEnd"/>
+      <w:r>
+        <w:t xml:space="preserve"> z powodu wcze</w:t>
+      </w:r>
+      <w:r>
+        <w:t xml:space="preserve">śniejszych komplikacji </w:t>
+      </w:r>
+      <w:proofErr w:type="spellStart"/>
+      <w:r>
+        <w:t>wyslanie</w:t>
+      </w:r>
+      <w:proofErr w:type="spellEnd"/>
+      <w:r>
+        <w:br/>
+        <w:t xml:space="preserve">+Zapytanie się AI </w:t>
+      </w:r>
+      <w:proofErr w:type="spellStart"/>
+      <w:r>
+        <w:t>Gamini</w:t>
+      </w:r>
+      <w:proofErr w:type="spellEnd"/>
+      <w:r>
+        <w:t xml:space="preserve"> jak oznaczyć puste pole (spacje):</w:t>
+      </w:r>
+    </w:p>
+    <w:p/>
+    <w:p/>
+    <w:p>
+      <w:pPr>
+        <w:pStyle w:val="NormalnyWeb"/>
+      </w:pPr>
+    </w:p>
+    <w:p/>
+    <w:p/>
+    <w:p/>
+    <w:p/>
+    <w:p/>
+    <w:p/>
+    <w:p/>
+    <w:p/>
+    <w:p>
+      <w:r>
+        <w:br/>
+      </w:r>
+    </w:p>
+    <w:p>
+      <w:r>
+        <w:t xml:space="preserve">+ Stworzenie planszy gry, czyli labiryntu po którym będzie się poruszać gracz w celu zebraniu wszystkich </w:t>
+      </w:r>
+      <w:proofErr w:type="spellStart"/>
+      <w:r>
+        <w:t>skarbow</w:t>
+      </w:r>
+      <w:proofErr w:type="spellEnd"/>
+      <w:r>
+        <w:t>.</w:t>
+      </w:r>
+      <w:r>
+        <w:br/>
+        <w:t xml:space="preserve">+ Plansza jest zbudowana z 0, 1, 5 oraz </w:t>
+      </w:r>
+      <w:proofErr w:type="spellStart"/>
+      <w:r>
+        <w:t>spcji</w:t>
+      </w:r>
+      <w:proofErr w:type="spellEnd"/>
+      <w:r>
+        <w:t xml:space="preserve">, czyli ‘ ‘ , które kolejno </w:t>
+      </w:r>
+      <w:proofErr w:type="spellStart"/>
+      <w:r>
+        <w:t>oz</w:t>
+      </w:r>
+      <w:r>
+        <w:t>naczaja</w:t>
+      </w:r>
+      <w:proofErr w:type="spellEnd"/>
+      <w:r>
+        <w:t xml:space="preserve"> ściany gracza skarby oraz wolne pola po których będzie się </w:t>
+      </w:r>
+      <w:proofErr w:type="spellStart"/>
+      <w:r>
+        <w:t>mogl</w:t>
+      </w:r>
+      <w:proofErr w:type="spellEnd"/>
+      <w:r>
+        <w:t xml:space="preserve"> poruszać gracz.</w:t>
+      </w:r>
+      <w:r>
+        <w:br/>
+        <w:t xml:space="preserve">+ W labiryncie będzie ukryte 5 </w:t>
+      </w:r>
+      <w:proofErr w:type="spellStart"/>
+      <w:r>
+        <w:t>skarbow</w:t>
+      </w:r>
+      <w:proofErr w:type="spellEnd"/>
+      <w:r>
+        <w:t xml:space="preserve"> które gracz będzie </w:t>
+      </w:r>
+      <w:proofErr w:type="spellStart"/>
+      <w:r>
+        <w:t>musial</w:t>
+      </w:r>
+      <w:proofErr w:type="spellEnd"/>
+      <w:r>
+        <w:t xml:space="preserve"> </w:t>
+      </w:r>
+      <w:proofErr w:type="spellStart"/>
+      <w:r>
+        <w:t>zebrac</w:t>
+      </w:r>
+      <w:proofErr w:type="spellEnd"/>
+      <w:r>
+        <w:t xml:space="preserve"> aby </w:t>
+      </w:r>
+      <w:proofErr w:type="spellStart"/>
+      <w:r>
+        <w:t>wygrac</w:t>
+      </w:r>
+      <w:proofErr w:type="spellEnd"/>
+      <w:r>
+        <w:t xml:space="preserve"> </w:t>
+      </w:r>
+      <w:proofErr w:type="spellStart"/>
+      <w:r>
+        <w:t>gre</w:t>
+      </w:r>
+      <w:proofErr w:type="spellEnd"/>
+      <w:r>
+        <w:br/>
+        <w:t xml:space="preserve">+ </w:t>
+      </w:r>
+      <w:proofErr w:type="spellStart"/>
+      <w:r>
+        <w:t>Swtorzenie</w:t>
+      </w:r>
+      <w:proofErr w:type="spellEnd"/>
+      <w:r>
+        <w:t xml:space="preserve"> kodu który będzie </w:t>
+      </w:r>
+      <w:proofErr w:type="spellStart"/>
+      <w:r>
+        <w:t>wypisywal</w:t>
+      </w:r>
+      <w:proofErr w:type="spellEnd"/>
+      <w:r>
+        <w:t xml:space="preserve"> </w:t>
+      </w:r>
+      <w:proofErr w:type="spellStart"/>
+      <w:r>
+        <w:t>labirytn</w:t>
+      </w:r>
+      <w:proofErr w:type="spellEnd"/>
+      <w:r>
+        <w:br/>
+        <w:t xml:space="preserve">+ Zapisanie i </w:t>
+      </w:r>
+      <w:proofErr w:type="spellStart"/>
+      <w:r>
+        <w:t>wyslanie</w:t>
+      </w:r>
+      <w:proofErr w:type="spellEnd"/>
+      <w:r>
+        <w:t xml:space="preserve"> zaktualizowanych i </w:t>
+      </w:r>
+      <w:proofErr w:type="spellStart"/>
+      <w:r>
+        <w:t>rozrzerzonych</w:t>
+      </w:r>
+      <w:proofErr w:type="spellEnd"/>
+      <w:r>
+        <w:t xml:space="preserve"> </w:t>
+      </w:r>
+      <w:proofErr w:type="spellStart"/>
+      <w:r>
+        <w:t>plikow</w:t>
+      </w:r>
+      <w:proofErr w:type="spellEnd"/>
+      <w:r>
+        <w:t xml:space="preserve"> na gita</w:t>
+      </w:r>
+    </w:p>
+    <w:p>
+      <w:r>
+        <w:t>3.Rezultaty</w:t>
+      </w:r>
+      <w:r>
+        <w:br/>
+        <w:t>+ Wszystko się ładnie zapisuje i działa</w:t>
+      </w:r>
+      <w:r>
+        <w:br/>
+        <w:t xml:space="preserve">+ Kod i gra na razie działa perfekcyjnie i idealnie wypisuje </w:t>
+      </w:r>
+      <w:proofErr w:type="spellStart"/>
+      <w:r>
+        <w:t>tabelke</w:t>
+      </w:r>
+      <w:proofErr w:type="spellEnd"/>
+      <w:r>
+        <w:t xml:space="preserve"> </w:t>
+      </w:r>
+      <w:proofErr w:type="spellStart"/>
+      <w:r>
+        <w:t>inforamcyjna</w:t>
+      </w:r>
+      <w:proofErr w:type="spellEnd"/>
+      <w:r>
+        <w:t xml:space="preserve"> oraz plansze czyli labirynt tak jak miałem w planach</w:t>
+      </w:r>
+    </w:p>
+    <w:p>
+      <w:pPr>
+        <w:pBdr>
+          <w:bottom w:val="double" w:sz="6" w:space="1" w:color="auto"/>
+        </w:pBdr>
+      </w:pPr>
+    </w:p>
+    <w:p>
+      <w:r>
+        <w:t xml:space="preserve">Dokumentacja Projektu: Gra - </w:t>
+      </w:r>
+      <w:proofErr w:type="spellStart"/>
+      <w:r>
+        <w:t>gra_tablice_dwuwymiarowe</w:t>
+      </w:r>
+      <w:proofErr w:type="spellEnd"/>
+    </w:p>
+    <w:p>
+      <w:r>
+        <w:t>Autor: Szymon Jasiński</w:t>
+      </w:r>
+    </w:p>
+    <w:p>
+      <w:pPr>
+        <w:pBdr>
+          <w:bottom w:val="double" w:sz="6" w:space="1" w:color="auto"/>
+        </w:pBdr>
+      </w:pPr>
+      <w:r>
+        <w:t>Data: 09.06.2026 r.</w:t>
+      </w:r>
+    </w:p>
+    <w:p/>
+    <w:p>
+      <w:r>
+        <w:t>1.Opis pracy</w:t>
+      </w:r>
+      <w:r>
+        <w:br/>
+      </w:r>
+      <w:r>
+        <w:t xml:space="preserve">Dzisiaj skupiłem się na stworzeniu kodu dzięki któremu będzie można się poruszać po labiryncie i ruchy będą nanoszone na plansze w czasie rzeczywistym a plansza będzie się </w:t>
+      </w:r>
+      <w:r>
+        <w:t>nadpisywać.</w:t>
+      </w:r>
+    </w:p>
+    <w:p>
+      <w:r>
+        <w:rPr>
+          <w:rFonts w:ascii="Times New Roman" w:eastAsia="Times New Roman" w:hAnsi="Times New Roman" w:cs="Times New Roman"/>
+          <w:noProof/>
+          <w:sz w:val="24"/>
+          <w:szCs w:val="24"/>
+          <w:lang w:eastAsia="pl-PL"/>
+        </w:rPr>
+        <w:drawing>
+          <wp:anchor distT="0" distB="0" distL="114300" distR="114300" simplePos="0" relativeHeight="251675136" behindDoc="0" locked="0" layoutInCell="1" allowOverlap="1" wp14:anchorId="386EF313" wp14:editId="136FF819">
+            <wp:simplePos x="0" y="0"/>
+            <wp:positionH relativeFrom="column">
+              <wp:posOffset>2392432</wp:posOffset>
+            </wp:positionH>
+            <wp:positionV relativeFrom="paragraph">
+              <wp:posOffset>492125</wp:posOffset>
+            </wp:positionV>
+            <wp:extent cx="4208834" cy="6213310"/>
+            <wp:effectExtent l="0" t="0" r="0" b="0"/>
+            <wp:wrapNone/>
+            <wp:docPr id="3" name="Obraz 3" descr="C:\Users\jasin\OneDrive\Obrazy\Zrzuty ekranu\Zrzut ekranu (234).png"/>
+            <wp:cNvGraphicFramePr>
+              <a:graphicFrameLocks xmlns:a="http://schemas.openxmlformats.org/drawingml/2006/main" noChangeAspect="1"/>
+            </wp:cNvGraphicFramePr>
+            <a:graphic xmlns:a="http://schemas.openxmlformats.org/drawingml/2006/main">
+              <a:graphicData uri="http://schemas.openxmlformats.org/drawingml/2006/picture">
+                <pic:pic xmlns:pic="http://schemas.openxmlformats.org/drawingml/2006/picture">
+                  <pic:nvPicPr>
+                    <pic:cNvPr id="0" name="Picture 5" descr="C:\Users\jasin\OneDrive\Obrazy\Zrzuty ekranu\Zrzut ekranu (234).png"/>
+                    <pic:cNvPicPr>
+                      <a:picLocks noChangeAspect="1" noChangeArrowheads="1"/>
+                    </pic:cNvPicPr>
+                  </pic:nvPicPr>
+                  <pic:blipFill>
+                    <a:blip r:embed="rId5">
+                      <a:extLst>
+                        <a:ext uri="{28A0092B-C50C-407E-A947-70E740481C1C}">
+                          <a14:useLocalDpi xmlns:a14="http://schemas.microsoft.com/office/drawing/2010/main" val="0"/>
+                        </a:ext>
+                      </a:extLst>
+                    </a:blip>
+                    <a:srcRect/>
+                    <a:stretch>
+                      <a:fillRect/>
+                    </a:stretch>
+                  </pic:blipFill>
+                  <pic:spPr bwMode="auto">
+                    <a:xfrm>
+                      <a:off x="0" y="0"/>
+                      <a:ext cx="4208834" cy="6213310"/>
+                    </a:xfrm>
+                    <a:prstGeom prst="rect">
+                      <a:avLst/>
+                    </a:prstGeom>
+                    <a:noFill/>
+                    <a:ln>
+                      <a:noFill/>
+                    </a:ln>
+                  </pic:spPr>
+                </pic:pic>
+              </a:graphicData>
+            </a:graphic>
+            <wp14:sizeRelH relativeFrom="page">
+              <wp14:pctWidth>0</wp14:pctWidth>
+            </wp14:sizeRelH>
+            <wp14:sizeRelV relativeFrom="page">
+              <wp14:pctHeight>0</wp14:pctHeight>
+            </wp14:sizeRelV>
+          </wp:anchor>
+        </w:drawing>
+      </w:r>
+      <w:r>
+        <w:t>2.Wykonanie czynności:</w:t>
+      </w:r>
+      <w:r>
+        <w:br/>
+        <w:t xml:space="preserve">+ W pierwszej kolejności zapytałem się AI </w:t>
+      </w:r>
+      <w:proofErr w:type="spellStart"/>
+      <w:r>
+        <w:t>Gamini</w:t>
+      </w:r>
+      <w:proofErr w:type="spellEnd"/>
+      <w:r>
+        <w:t xml:space="preserve"> jakie komendy by cos takiego </w:t>
+      </w:r>
+      <w:proofErr w:type="spellStart"/>
+      <w:r>
+        <w:t>obslugiwaly</w:t>
+      </w:r>
+      <w:proofErr w:type="spellEnd"/>
+      <w:r>
+        <w:t xml:space="preserve"> i jak to zrobić:</w:t>
+      </w:r>
+    </w:p>
+    <w:p>
+      <w:r>
+        <w:rPr>
+          <w:rFonts w:ascii="Times New Roman" w:eastAsia="Times New Roman" w:hAnsi="Times New Roman" w:cs="Times New Roman"/>
+          <w:noProof/>
+          <w:sz w:val="24"/>
+          <w:szCs w:val="24"/>
+          <w:lang w:eastAsia="pl-PL"/>
+        </w:rPr>
+        <w:drawing>
+          <wp:anchor distT="0" distB="0" distL="114300" distR="114300" simplePos="0" relativeHeight="251663872" behindDoc="1" locked="0" layoutInCell="1" allowOverlap="1" wp14:anchorId="6E40BD94" wp14:editId="44B5C7FB">
+            <wp:simplePos x="0" y="0"/>
+            <wp:positionH relativeFrom="column">
+              <wp:posOffset>-829687</wp:posOffset>
+            </wp:positionH>
+            <wp:positionV relativeFrom="paragraph">
+              <wp:posOffset>280356</wp:posOffset>
+            </wp:positionV>
+            <wp:extent cx="3726415" cy="5098415"/>
+            <wp:effectExtent l="0" t="0" r="0" b="0"/>
+            <wp:wrapNone/>
+            <wp:docPr id="2" name="Obraz 2" descr="C:\Users\jasin\OneDrive\Obrazy\Zrzuty ekranu\Zrzut ekranu (233).png"/>
+            <wp:cNvGraphicFramePr>
+              <a:graphicFrameLocks xmlns:a="http://schemas.openxmlformats.org/drawingml/2006/main" noChangeAspect="1"/>
+            </wp:cNvGraphicFramePr>
+            <a:graphic xmlns:a="http://schemas.openxmlformats.org/drawingml/2006/main">
+              <a:graphicData uri="http://schemas.openxmlformats.org/drawingml/2006/picture">
+                <pic:pic xmlns:pic="http://schemas.openxmlformats.org/drawingml/2006/picture">
+                  <pic:nvPicPr>
+                    <pic:cNvPr id="0" name="Picture 3" descr="C:\Users\jasin\OneDrive\Obrazy\Zrzuty ekranu\Zrzut ekranu (233).png"/>
+                    <pic:cNvPicPr>
+                      <a:picLocks noChangeAspect="1" noChangeArrowheads="1"/>
+                    </pic:cNvPicPr>
+                  </pic:nvPicPr>
+                  <pic:blipFill>
+                    <a:blip r:embed="rId6">
+                      <a:extLst>
+                        <a:ext uri="{28A0092B-C50C-407E-A947-70E740481C1C}">
+                          <a14:useLocalDpi xmlns:a14="http://schemas.microsoft.com/office/drawing/2010/main" val="0"/>
+                        </a:ext>
+                      </a:extLst>
+                    </a:blip>
+                    <a:srcRect/>
+                    <a:stretch>
+                      <a:fillRect/>
+                    </a:stretch>
+                  </pic:blipFill>
+                  <pic:spPr bwMode="auto">
+                    <a:xfrm>
+                      <a:off x="0" y="0"/>
+                      <a:ext cx="3726415" cy="5098415"/>
+                    </a:xfrm>
+                    <a:prstGeom prst="rect">
+                      <a:avLst/>
+                    </a:prstGeom>
+                    <a:noFill/>
+                    <a:ln>
+                      <a:noFill/>
+                    </a:ln>
+                  </pic:spPr>
+                </pic:pic>
+              </a:graphicData>
+            </a:graphic>
+            <wp14:sizeRelH relativeFrom="page">
+              <wp14:pctWidth>0</wp14:pctWidth>
+            </wp14:sizeRelH>
+            <wp14:sizeRelV relativeFrom="page">
+              <wp14:pctHeight>0</wp14:pctHeight>
+            </wp14:sizeRelV>
+          </wp:anchor>
+        </w:drawing>
+      </w:r>
+    </w:p>
+    <w:p/>
+    <w:p/>
+    <w:p/>
+    <w:p/>
+    <w:p/>
+    <w:p>
+      <w:pPr>
+        <w:spacing w:before="100" w:beforeAutospacing="1" w:after="100" w:afterAutospacing="1" w:line="240" w:lineRule="auto"/>
+        <w:rPr>
+          <w:rFonts w:ascii="Times New Roman" w:eastAsia="Times New Roman" w:hAnsi="Times New Roman" w:cs="Times New Roman"/>
+          <w:sz w:val="24"/>
+          <w:szCs w:val="24"/>
+          <w:lang w:eastAsia="pl-PL"/>
+        </w:rPr>
+      </w:pPr>
+    </w:p>
+    <w:p/>
+    <w:p/>
+    <w:p/>
+    <w:p/>
+    <w:p>
+      <w:pPr>
+        <w:spacing w:before="100" w:beforeAutospacing="1" w:after="100" w:afterAutospacing="1" w:line="240" w:lineRule="auto"/>
+        <w:rPr>
+          <w:rFonts w:ascii="Times New Roman" w:eastAsia="Times New Roman" w:hAnsi="Times New Roman" w:cs="Times New Roman"/>
+          <w:sz w:val="24"/>
+          <w:szCs w:val="24"/>
+          <w:lang w:eastAsia="pl-PL"/>
+        </w:rPr>
+      </w:pPr>
+    </w:p>
+    <w:p/>
+    <w:p/>
+    <w:p/>
+    <w:p/>
+    <w:p/>
+    <w:p/>
+    <w:p/>
+    <w:p/>
+    <w:p>
+      <w:r>
+        <w:lastRenderedPageBreak/>
+        <w:t xml:space="preserve">+ </w:t>
+      </w:r>
+      <w:proofErr w:type="spellStart"/>
+      <w:r>
+        <w:t>Dodalem</w:t>
+      </w:r>
+      <w:proofErr w:type="spellEnd"/>
+      <w:r>
+        <w:t xml:space="preserve"> bibliotekę, zmienna </w:t>
+      </w:r>
+      <w:proofErr w:type="spellStart"/>
+      <w:r>
+        <w:t>opisujaca</w:t>
+      </w:r>
+      <w:proofErr w:type="spellEnd"/>
+      <w:r>
+        <w:t xml:space="preserve"> pozycje gracza, zmienna licznika </w:t>
+      </w:r>
+      <w:proofErr w:type="spellStart"/>
+      <w:r>
+        <w:t>skarbow</w:t>
+      </w:r>
+      <w:proofErr w:type="spellEnd"/>
+      <w:r>
+        <w:t xml:space="preserve">, zmienna stanu     gry w której 0 </w:t>
+      </w:r>
+      <w:proofErr w:type="spellStart"/>
+      <w:r>
+        <w:t>ozancza</w:t>
+      </w:r>
+      <w:proofErr w:type="spellEnd"/>
+      <w:r>
+        <w:t xml:space="preserve"> </w:t>
+      </w:r>
+      <w:proofErr w:type="spellStart"/>
+      <w:r>
+        <w:t>gre</w:t>
+      </w:r>
+      <w:proofErr w:type="spellEnd"/>
+      <w:r>
+        <w:t xml:space="preserve">; 1 oznacza wygrana, czyli zebranie wszystkich </w:t>
+      </w:r>
+      <w:proofErr w:type="spellStart"/>
+      <w:r>
+        <w:t>skarbow</w:t>
+      </w:r>
+      <w:proofErr w:type="spellEnd"/>
+      <w:r>
+        <w:t xml:space="preserve">; 2 oznacza przegrana, czyli wejście w </w:t>
+      </w:r>
+      <w:proofErr w:type="spellStart"/>
+      <w:r>
+        <w:t>ściane</w:t>
+      </w:r>
+      <w:proofErr w:type="spellEnd"/>
+      <w:r>
+        <w:t xml:space="preserve">; 3 oznacza zatrzymanie gry i wyjście poprzez </w:t>
+      </w:r>
+      <w:proofErr w:type="spellStart"/>
+      <w:r>
+        <w:t>wcisniecie</w:t>
+      </w:r>
+      <w:proofErr w:type="spellEnd"/>
+      <w:r>
+        <w:t xml:space="preserve"> przez gracza </w:t>
+      </w:r>
+      <w:proofErr w:type="spellStart"/>
+      <w:r>
+        <w:t>kalwisza</w:t>
+      </w:r>
+      <w:proofErr w:type="spellEnd"/>
+      <w:r>
+        <w:t xml:space="preserve"> x.</w:t>
+      </w:r>
+      <w:r>
+        <w:br/>
+        <w:t xml:space="preserve">+ Stworzyłem </w:t>
+      </w:r>
+      <w:proofErr w:type="spellStart"/>
+      <w:r>
+        <w:t>petle</w:t>
+      </w:r>
+      <w:proofErr w:type="spellEnd"/>
+      <w:r>
+        <w:t xml:space="preserve"> </w:t>
+      </w:r>
+      <w:proofErr w:type="spellStart"/>
+      <w:r>
+        <w:t>while</w:t>
+      </w:r>
+      <w:proofErr w:type="spellEnd"/>
+      <w:r>
+        <w:t xml:space="preserve"> </w:t>
+      </w:r>
+      <w:proofErr w:type="spellStart"/>
+      <w:r>
+        <w:t>okreslajaca</w:t>
+      </w:r>
+      <w:proofErr w:type="spellEnd"/>
+      <w:r>
+        <w:t xml:space="preserve"> stan gry dzięki której gra będzie </w:t>
+      </w:r>
+      <w:proofErr w:type="spellStart"/>
+      <w:r>
+        <w:t>dzilac</w:t>
+      </w:r>
+      <w:proofErr w:type="spellEnd"/>
+      <w:r>
+        <w:br/>
+        <w:t xml:space="preserve">+ </w:t>
+      </w:r>
+      <w:proofErr w:type="spellStart"/>
+      <w:r>
+        <w:t>Stworzylem</w:t>
+      </w:r>
+      <w:proofErr w:type="spellEnd"/>
+      <w:r>
+        <w:t xml:space="preserve"> znak klawisz poprzez komendę char i </w:t>
+      </w:r>
+      <w:proofErr w:type="spellStart"/>
+      <w:r>
+        <w:t>uzylem</w:t>
+      </w:r>
+      <w:proofErr w:type="spellEnd"/>
+      <w:r>
+        <w:t xml:space="preserve"> komendy _</w:t>
+      </w:r>
+      <w:proofErr w:type="spellStart"/>
+      <w:r>
+        <w:t>getch</w:t>
+      </w:r>
+      <w:proofErr w:type="spellEnd"/>
+      <w:r>
+        <w:t xml:space="preserve">() </w:t>
+      </w:r>
+      <w:proofErr w:type="spellStart"/>
+      <w:r>
+        <w:t>dizeki</w:t>
+      </w:r>
+      <w:proofErr w:type="spellEnd"/>
+      <w:r>
+        <w:t xml:space="preserve"> której program czeka na </w:t>
+      </w:r>
+      <w:proofErr w:type="spellStart"/>
+      <w:r>
+        <w:t>wcisiecie</w:t>
+      </w:r>
+      <w:proofErr w:type="spellEnd"/>
+      <w:r>
+        <w:t xml:space="preserve"> jakiegoś klawisza z klawiatury</w:t>
+      </w:r>
+      <w:r>
+        <w:br/>
+        <w:t xml:space="preserve">+ </w:t>
+      </w:r>
+      <w:proofErr w:type="spellStart"/>
+      <w:r>
+        <w:t>Stworzylem</w:t>
+      </w:r>
+      <w:proofErr w:type="spellEnd"/>
+      <w:r>
+        <w:t xml:space="preserve"> zmienne ruchowe </w:t>
+      </w:r>
+      <w:proofErr w:type="spellStart"/>
+      <w:r>
+        <w:t>garcza</w:t>
+      </w:r>
+      <w:proofErr w:type="spellEnd"/>
+      <w:r>
+        <w:t xml:space="preserve"> które </w:t>
+      </w:r>
+      <w:proofErr w:type="spellStart"/>
+      <w:r>
+        <w:t>okreslaja</w:t>
+      </w:r>
+      <w:proofErr w:type="spellEnd"/>
+      <w:r>
+        <w:t xml:space="preserve"> </w:t>
+      </w:r>
+      <w:proofErr w:type="spellStart"/>
+      <w:r>
+        <w:t>zamierzany</w:t>
+      </w:r>
+      <w:proofErr w:type="spellEnd"/>
+      <w:r>
+        <w:t xml:space="preserve"> ruch i nowa pozycje gracza</w:t>
+      </w:r>
+      <w:r>
+        <w:br/>
+        <w:t xml:space="preserve">+ Przypisałem odpowiednim klawisza dany ruch: w- w </w:t>
+      </w:r>
+      <w:proofErr w:type="spellStart"/>
+      <w:r>
+        <w:t>gore</w:t>
+      </w:r>
+      <w:proofErr w:type="spellEnd"/>
+      <w:r>
+        <w:t>, s- w dół, a- w lewo, d-w prawo</w:t>
+      </w:r>
+      <w:r>
+        <w:br/>
+        <w:t>+ Stworzyłem kod który aktualizuje labirynt po ruchu gracza</w:t>
+      </w:r>
+    </w:p>
+    <w:p>
+      <w:r>
+        <w:t>3.Rezultaty</w:t>
+      </w:r>
+      <w:r>
+        <w:br/>
+        <w:t xml:space="preserve">Program </w:t>
+      </w:r>
+      <w:proofErr w:type="spellStart"/>
+      <w:r>
+        <w:t>dzila</w:t>
+      </w:r>
+      <w:proofErr w:type="spellEnd"/>
+      <w:r>
+        <w:t xml:space="preserve"> poprawnie można się już poruszać po labiryncie który natychmiastowo reaguje na ruch i się </w:t>
+      </w:r>
+      <w:proofErr w:type="spellStart"/>
+      <w:r>
+        <w:t>nadpsiuje</w:t>
+      </w:r>
+      <w:proofErr w:type="spellEnd"/>
+      <w:r>
+        <w:t xml:space="preserve"> oraz aktualizuje. Przy pomocy AI udało się mi </w:t>
+      </w:r>
+      <w:proofErr w:type="spellStart"/>
+      <w:r>
+        <w:t>swtorzyc</w:t>
+      </w:r>
+      <w:proofErr w:type="spellEnd"/>
+      <w:r>
+        <w:t xml:space="preserve"> odpowiedni kod odpowiadający za ruchy gracza i </w:t>
       </w:r>
       <w:proofErr w:type="spellStart"/>
       <w:r>
@@ -429,219 +1228,19 @@
       </w:r>
       <w:proofErr w:type="spellEnd"/>
       <w:r>
-        <w:t xml:space="preserve"> się popranie zapisuje w chmurze i </w:t>
-      </w:r>
-      <w:proofErr w:type="spellStart"/>
-      <w:r>
-        <w:t>wysyla</w:t>
-      </w:r>
-      <w:proofErr w:type="spellEnd"/>
-      <w:r>
-        <w:t xml:space="preserve"> oraz na stworzeniu planszy gry czyli labiryntu.</w:t>
-      </w:r>
-    </w:p>
-    <w:p>
-      <w:r>
-        <w:t>2.Wykonanie czynności:</w:t>
-      </w:r>
-      <w:r>
-        <w:br/>
-        <w:t xml:space="preserve">+ Wysłanie wczorajszych </w:t>
-      </w:r>
-      <w:proofErr w:type="spellStart"/>
-      <w:r>
-        <w:t>plikow</w:t>
-      </w:r>
-      <w:proofErr w:type="spellEnd"/>
-      <w:r>
-        <w:t xml:space="preserve"> na </w:t>
-      </w:r>
-      <w:proofErr w:type="spellStart"/>
-      <w:r>
-        <w:t>chmure</w:t>
-      </w:r>
-      <w:proofErr w:type="spellEnd"/>
-      <w:r>
-        <w:t xml:space="preserve"> z powodu wcześniejszych komplikacji </w:t>
-      </w:r>
-      <w:proofErr w:type="spellStart"/>
-      <w:r>
-        <w:t>wyslaniem</w:t>
-      </w:r>
-      <w:proofErr w:type="spellEnd"/>
-      <w:r>
-        <w:br/>
-        <w:t xml:space="preserve">+ Stworzenie planszy gry, czyli labiryntu po którym będzie się poruszać gracz w celu zebraniu wszystkich </w:t>
-      </w:r>
-      <w:proofErr w:type="spellStart"/>
-      <w:r>
-        <w:t>skarbow</w:t>
-      </w:r>
-      <w:proofErr w:type="spellEnd"/>
-      <w:r>
-        <w:t>.</w:t>
-      </w:r>
-      <w:r>
-        <w:br/>
-        <w:t xml:space="preserve">+ Plansza jest zbudowana z 0, 1, 5 oraz </w:t>
-      </w:r>
-      <w:proofErr w:type="spellStart"/>
-      <w:r>
-        <w:t>spcji</w:t>
-      </w:r>
-      <w:proofErr w:type="spellEnd"/>
-      <w:r>
-        <w:t xml:space="preserve">, które kolejno </w:t>
-      </w:r>
-      <w:proofErr w:type="spellStart"/>
-      <w:r>
-        <w:t>zonaczaja</w:t>
-      </w:r>
-      <w:proofErr w:type="spellEnd"/>
-      <w:r>
-        <w:t xml:space="preserve"> ściany gracza skarby oraz wolne pola po których będzie się </w:t>
-      </w:r>
-      <w:proofErr w:type="spellStart"/>
-      <w:r>
-        <w:t>mogl</w:t>
-      </w:r>
-      <w:proofErr w:type="spellEnd"/>
-      <w:r>
-        <w:t xml:space="preserve"> poruszać gracz.</w:t>
-      </w:r>
-      <w:r>
-        <w:br/>
-        <w:t xml:space="preserve">+ W labiryncie będzie ukryte 5 </w:t>
-      </w:r>
-      <w:proofErr w:type="spellStart"/>
-      <w:r>
-        <w:t>skarbow</w:t>
-      </w:r>
-      <w:proofErr w:type="spellEnd"/>
-      <w:r>
-        <w:t xml:space="preserve"> które gracz będzie </w:t>
-      </w:r>
-      <w:proofErr w:type="spellStart"/>
-      <w:r>
-        <w:t>musial</w:t>
-      </w:r>
-      <w:proofErr w:type="spellEnd"/>
-      <w:r>
-        <w:t xml:space="preserve"> </w:t>
-      </w:r>
-      <w:proofErr w:type="spellStart"/>
-      <w:r>
-        <w:t>zebrac</w:t>
-      </w:r>
-      <w:proofErr w:type="spellEnd"/>
-      <w:r>
-        <w:t xml:space="preserve"> aby </w:t>
-      </w:r>
-      <w:proofErr w:type="spellStart"/>
-      <w:r>
-        <w:t>wygrac</w:t>
-      </w:r>
-      <w:proofErr w:type="spellEnd"/>
-      <w:r>
-        <w:t xml:space="preserve"> </w:t>
-      </w:r>
-      <w:proofErr w:type="spellStart"/>
-      <w:r>
-        <w:t>gre</w:t>
-      </w:r>
-      <w:proofErr w:type="spellEnd"/>
-      <w:r>
-        <w:br/>
-        <w:t xml:space="preserve">+ </w:t>
-      </w:r>
-      <w:proofErr w:type="spellStart"/>
-      <w:r>
-        <w:t>Swtorzenie</w:t>
-      </w:r>
-      <w:proofErr w:type="spellEnd"/>
-      <w:r>
-        <w:t xml:space="preserve"> kodu który będzie </w:t>
-      </w:r>
-      <w:proofErr w:type="spellStart"/>
-      <w:r>
-        <w:t>wypisywal</w:t>
-      </w:r>
-      <w:proofErr w:type="spellEnd"/>
-      <w:r>
-        <w:t xml:space="preserve"> </w:t>
-      </w:r>
-      <w:proofErr w:type="spellStart"/>
-      <w:r>
-        <w:t>labirytn</w:t>
-      </w:r>
-      <w:proofErr w:type="spellEnd"/>
-      <w:r>
-        <w:br/>
-        <w:t xml:space="preserve">+ Zapisanie i </w:t>
-      </w:r>
-      <w:proofErr w:type="spellStart"/>
-      <w:r>
-        <w:t>wyslanie</w:t>
-      </w:r>
-      <w:proofErr w:type="spellEnd"/>
-      <w:r>
-        <w:t xml:space="preserve"> zaktualizowanych i </w:t>
-      </w:r>
-      <w:proofErr w:type="spellStart"/>
-      <w:r>
-        <w:t>rozrzerzonych</w:t>
-      </w:r>
-      <w:proofErr w:type="spellEnd"/>
-      <w:r>
-        <w:t xml:space="preserve"> </w:t>
-      </w:r>
-      <w:proofErr w:type="spellStart"/>
-      <w:r>
-        <w:t>plikow</w:t>
-      </w:r>
-      <w:proofErr w:type="spellEnd"/>
-      <w:r>
-        <w:t xml:space="preserve"> na gita</w:t>
-      </w:r>
-    </w:p>
-    <w:p>
-      <w:r>
-        <w:t>3.Rezultaty</w:t>
-      </w:r>
-      <w:r>
-        <w:br/>
-        <w:t>+ Wszystko się ładnie zapisuje i działa</w:t>
-      </w:r>
-      <w:r>
-        <w:br/>
-        <w:t xml:space="preserve">+ Kod i gra na razie działa perfekcyjnie i idealnie wypisuje </w:t>
-      </w:r>
-      <w:proofErr w:type="spellStart"/>
-      <w:r>
-        <w:t>tabelke</w:t>
-      </w:r>
-      <w:proofErr w:type="spellEnd"/>
-      <w:r>
-        <w:t xml:space="preserve"> </w:t>
-      </w:r>
-      <w:proofErr w:type="spellStart"/>
-      <w:r>
-        <w:t>inforamcyjna</w:t>
-      </w:r>
-      <w:proofErr w:type="spellEnd"/>
-      <w:r>
-        <w:t xml:space="preserve"> oraz plansze czyli labirynt tak jak miałem w planach</w:t>
+        <w:t xml:space="preserve"> idzie zgodnie z tym co </w:t>
+      </w:r>
+      <w:proofErr w:type="spellStart"/>
+      <w:r>
+        <w:t>zakladalem</w:t>
+      </w:r>
+      <w:proofErr w:type="spellEnd"/>
+      <w:r>
+        <w:t xml:space="preserve"> na początku.</w:t>
       </w:r>
       <w:bookmarkStart w:id="0" w:name="_GoBack"/>
       <w:bookmarkEnd w:id="0"/>
     </w:p>
-    <w:p/>
-    <w:p/>
-    <w:p/>
-    <w:p/>
-    <w:p/>
-    <w:p/>
-    <w:p/>
     <w:sectPr>
       <w:pgSz w:w="11906" w:h="16838"/>
       <w:pgMar w:top="1417" w:right="1417" w:bottom="1417" w:left="1417" w:header="708" w:footer="708" w:gutter="0"/>
@@ -1074,6 +1673,23 @@
     <w:semiHidden/>
     <w:unhideWhenUsed/>
   </w:style>
+  <w:style w:type="paragraph" w:styleId="NormalnyWeb">
+    <w:name w:val="Normal (Web)"/>
+    <w:basedOn w:val="Normalny"/>
+    <w:uiPriority w:val="99"/>
+    <w:semiHidden/>
+    <w:unhideWhenUsed/>
+    <w:rsid w:val="006370C9"/>
+    <w:pPr>
+      <w:spacing w:before="100" w:beforeAutospacing="1" w:after="100" w:afterAutospacing="1" w:line="240" w:lineRule="auto"/>
+    </w:pPr>
+    <w:rPr>
+      <w:rFonts w:ascii="Times New Roman" w:eastAsia="Times New Roman" w:hAnsi="Times New Roman" w:cs="Times New Roman"/>
+      <w:sz w:val="24"/>
+      <w:szCs w:val="24"/>
+      <w:lang w:eastAsia="pl-PL"/>
+    </w:rPr>
+  </w:style>
 </w:styles>
 </file>
 

</xml_diff>